<commit_message>
feat: pre-fill the dean's name (Prof. Masahisa Katsuno) in the template
Saves the editor from typing the dean's name on every issue.

- scripts/config.py: new constants DEAN_NAME, DEAN_NAME_PLAIN, DEAN_TITLE
  capturing the current dean (Prof. Masahisa Katsuno, MD PhD).
- scripts/build_template.py: new insert_dean_name() runs alongside
  insert_dean_photo() against Section 1's table:
    * Left credentials cell: "[Dean's Name]" -> "Prof. Masahisa Katsuno"
    * Right signature line:  "[Full Name], MD, PhD"
                              -> "Masahisa Katsuno, MD, PhD"
  A small _replace_paragraph_text() helper preserves the run's font,
  size, weight, italic and colour so the surrounding template restyle
  is not lost.
- Meridian_Newsletter_Template.docx regenerated with the values
  baked in.

When the next dean takes office, update DEAN_NAME / DEAN_NAME_PLAIN
in config.py and re-run `python build_newsletter.py build-template`.
</commit_message>
<xml_diff>
--- a/Meridian_Newsletter_Template.docx
+++ b/Meridian_Newsletter_Template.docx
@@ -368,14 +368,12 @@
             </w:pPr>
             <w:r>
               <w:rPr>
-                <w:rFonts w:eastAsia="Arial" w:ascii="Calibri" w:hAnsi="Calibri"/>
+                <w:rFonts w:ascii="Calibri" w:hAnsi="Calibri"/>
                 <w:b/>
-                <w:bCs/>
                 <w:color w:val="2D2D8E"/>
                 <w:sz w:val="19"/>
-                <w:szCs w:val="19"/>
-              </w:rPr>
-              <w:t>[Dean's Name]</w:t>
+              </w:rPr>
+              <w:t>Prof. Masahisa Katsuno</w:t>
             </w:r>
           </w:p>
           <w:p>
@@ -939,14 +937,12 @@
           <w:p>
             <w:r>
               <w:rPr>
-                <w:rFonts w:eastAsia="Arial" w:ascii="Calibri" w:hAnsi="Calibri"/>
+                <w:rFonts w:ascii="Calibri" w:hAnsi="Calibri"/>
                 <w:b/>
-                <w:bCs/>
                 <w:color w:val="2D2D8E"/>
                 <w:sz w:val="22"/>
-                <w:szCs w:val="22"/>
-              </w:rPr>
-              <w:t>[Full Name], MD, PhD</w:t>
+              </w:rPr>
+              <w:t>Masahisa Katsuno, MD, PhD</w:t>
             </w:r>
           </w:p>
           <w:p>

</xml_diff>